<commit_message>
create Return Work Equipment Module, adding inputs columns to work equipment details
</commit_message>
<xml_diff>
--- a/server/resources/tampletes/retur-echip-lucru.docx
+++ b/server/resources/tampletes/retur-echip-lucru.docx
@@ -639,6 +639,7 @@
               </w:rPr>
               <w:t>{</w:t>
             </w:r>
+            <w:proofErr w:type="spellStart"/>
             <w:r>
               <w:rPr>
                 <w:rFonts w:ascii="Calibri" w:hAnsi="Calibri"/>
@@ -646,8 +647,9 @@
                 <w:szCs w:val="22"/>
                 <w:lang w:val="ro-RO"/>
               </w:rPr>
-              <w:t>serie</w:t>
+              <w:t>marime</w:t>
             </w:r>
+            <w:proofErr w:type="spellEnd"/>
             <w:r>
               <w:rPr>
                 <w:rFonts w:ascii="Calibri" w:hAnsi="Calibri"/>

</xml_diff>